<commit_message>
Actualicé el documento del videojuego
</commit_message>
<xml_diff>
--- a/Momento 1/Explicacion video-juego basket.docx
+++ b/Momento 1/Explicacion video-juego basket.docx
@@ -4,39 +4,38 @@
   <w:body>
     <w:p>
       <w:r>
-        <w:rPr>
-          <w:b/>
-          <w:bCs/>
-        </w:rPr>
-        <w:t>Momento I: Contextualización</w:t>
+        <w:t>Versión mejorada y mas explicita</w:t>
       </w:r>
     </w:p>
     <w:p>
       <w:r>
-        <w:t>El proyecto consiste en el diseño de un videojuego basado en el baloncesto, en el cual el jugador vive una experiencia progresiva que inicia con un entrenamiento básico y culmina en una situación de competencia real. A través del juego, se busca que el jugador desarrolle habilidades como el control del balón, la coordinación, el salto y la precisión en los lanzamientos, recreando movimientos y situaciones similares a las del deporte.</w:t>
+        <w:t>N</w:t>
+      </w:r>
+      <w:r>
+        <w:t>ivel 1: Entrenamiento en entorno antiguo</w:t>
       </w:r>
     </w:p>
     <w:p>
       <w:r>
-        <w:t xml:space="preserve">El videojuego está dividido en dos niveles principales. En el primer nivel, el jugador se encuentra en una etapa de entrenamiento donde debe avanzar mientras </w:t>
-      </w:r>
-      <w:proofErr w:type="gramStart"/>
-      <w:r>
-        <w:t>dribla</w:t>
-      </w:r>
-      <w:proofErr w:type="gramEnd"/>
-      <w:r>
-        <w:t xml:space="preserve"> el balón. Durante este recorrido, se presentan diferentes obstáculos que debe superar mediante saltos, lo que le permite practicar el control del movimiento y mejorar su coordinación. Este nivel tiene como objetivo que el jugador aprenda las mecánicas básicas del juego y se familiarice con los controles.</w:t>
+        <w:t>En este nivel, el jugador se encuentra en un entorno ambientado en una época antigua, con estructuras sencillas que representan una forma primitiva del baloncesto. La vista es lateral tipo plataformero, similar a Mario Bros, donde el personaje se desplaza de izquierda a derecha.</w:t>
       </w:r>
     </w:p>
     <w:p>
       <w:r>
-        <w:t>En el segundo nivel, el jugador enfrenta un reto más complejo, ya que debe aplicar todo lo aprendido en el nivel anterior. En esta etapa aparece un tiempo límite que genera presión, además de un defensor que intenta dificultar el avance del jugador. El recorrido finaliza con un lanzamiento al aro, el cual puede estar en movimiento, lo que exige mayor precisión y concentración para lograr encestar.</w:t>
+        <w:t xml:space="preserve">La dinámica consiste en avanzar mientras se controla el balón mediante el </w:t>
+      </w:r>
+      <w:proofErr w:type="gramStart"/>
+      <w:r>
+        <w:t>drible</w:t>
+      </w:r>
+      <w:proofErr w:type="gramEnd"/>
+      <w:r>
+        <w:t>. Durante el recorrido aparecen obstáculos que deben ser esquivados mediante saltos.</w:t>
       </w:r>
     </w:p>
     <w:p>
       <w:r>
-        <w:t xml:space="preserve">En cuanto a las físicas del juego, se implementan diferentes conceptos que hacen la experiencia más realista. Se utiliza el movimiento parabólico en los saltos y lanzamientos del balón, el rebote en el control del balón durante el </w:t>
+        <w:t xml:space="preserve">Se implementan físicas como el movimiento parabólico en los saltos, el rebote del balón durante el </w:t>
       </w:r>
       <w:proofErr w:type="gramStart"/>
       <w:r>
@@ -44,10 +43,45 @@
       </w:r>
       <w:proofErr w:type="gramEnd"/>
       <w:r>
-        <w:t xml:space="preserve"> y el movimiento oscilatorio en elementos como el aro y el defensor. Además, la gravedad puede variar para modificar la dificultad del juego, haciendo que los movimientos cambien y el reto sea más dinámico.</w:t>
+        <w:t xml:space="preserve"> y el movimiento oscilatorio de algunos obstáculos.</w:t>
+      </w:r>
+    </w:p>
+    <w:p>
+      <w:r>
+        <w:t>El objetivo es completar el recorrido sin perder el control del balón. El personaje es ágil, pero presenta cierta inestabilidad que dificulta el control del balón.</w:t>
       </w:r>
     </w:p>
     <w:p/>
+    <w:p>
+      <w:r>
+        <w:t>Nivel 2: Partido 3 vs 3 en entorno espacial</w:t>
+      </w:r>
+    </w:p>
+    <w:p>
+      <w:r>
+        <w:t>En este nivel, el jugador participa en un partido de baloncesto en la Luna, donde la gravedad es menor. La vista es cenital (desde arriba), lo que permite un mejor control del movimiento en todas las direcciones.</w:t>
+      </w:r>
+    </w:p>
+    <w:p>
+      <w:r>
+        <w:t>La dinámica consiste en un partido 3 vs 3. El jugador controla un integrante del equipo y puede cambiar entre ellos, mientras los demás se mueven automáticamente, al igual que el equipo rival.</w:t>
+      </w:r>
+    </w:p>
+    <w:p>
+      <w:r>
+        <w:t>Las interacciones incluyen pases, robos, bloqueos y lanzamientos al aro. El sistema de puntuación se simplifica: cada enceste vale 1 punto, y el partido termina al alcanzar un puntaje (por ejemplo, 12) o cuando se acaba el tiempo.</w:t>
+      </w:r>
+    </w:p>
+    <w:p>
+      <w:r>
+        <w:t>Se aplican físicas como el movimiento parabólico del balón, la gravedad reducida y el movimiento automático de los jugadores.</w:t>
+      </w:r>
+    </w:p>
+    <w:p>
+      <w:r>
+        <w:t>El objetivo es anotar más puntos que el rival. El principal reto es tomar decisiones rápidas y adaptarse a las condiciones del entorno.</w:t>
+      </w:r>
+    </w:p>
     <w:sectPr>
       <w:pgSz w:w="12240" w:h="15840"/>
       <w:pgMar w:top="1417" w:right="1418" w:bottom="1417" w:left="1418" w:header="709" w:footer="709" w:gutter="0"/>

</xml_diff>